<commit_message>
v435.1.1: Formathinweise aus den Aktenstücken entfernt
Der Release-Lauf zu v435.1.0 scheiterte an der Dokumentqualitätsprüfung: Vier
neue Aktenstücke der Freiburger Versorgungswerksakte trugen am Fuß die Zeile
"Formathinweis: Dieses Aktenstück wird in Times New Roman, 11 pt, mit
ausschließlich dezimaler Gliederung ausgegeben." Der Prüfer wertet das zu Recht
als verräterischen Metahinweis; in einem echten Schreiben aus der Akte steht
keine Anweisung an den Setzer.

Die Zeile wurde aus allen 49 betroffenen DOCX entfernt, auch aus älteren
Beständen in Datenschutz-, KI-Recht- und HOAI-Akten. Das Hausformat bleibt
unverändert und ist im Dokument gesetzt statt im Text behauptet.

Gesamt-PDFs der neun betroffenen Akten neu gebaut. Validatoren grün.

Co-Authored-By: Claude Opus 4.8 <noreply@anthropic.com>
Claude-Session: https://claude.ai/code/session_01YXnmkjavncPDoNYycYaC5G
</commit_message>
<xml_diff>
--- a/testakten/bgb-at-altfraenkische-werkstatt/23_inserat_altwerk_aw_77_426.docx
+++ b/testakten/bgb-at-altfraenkische-werkstatt/23_inserat_altwerk_aw_77_426.docx
@@ -430,14 +430,6 @@
         <w:t>„Bei Angeboten von privat gilt das Widerrufsrecht für Verbraucherverträge nicht."</w:t>
       </w:r>
     </w:p>
-    <w:p>
-      <w:pPr>
-        <w:jc w:val="left"/>
-      </w:pPr>
-      <w:r>
-        <w:t>Formathinweis: Dieses Aktenstück wird in Times New Roman, 11 pt, mit ausschließlich dezimaler Gliederung ausgegeben.</w:t>
-      </w:r>
-    </w:p>
     <w:sectPr>
       <w:pgSz w:w="11906" w:h="16838"/>
       <w:pgMar w:top="1417" w:right="1417" w:bottom="1417" w:left="1417" w:header="720" w:footer="720" w:gutter="0"/>

</xml_diff>

<commit_message>
v435.1.1: Formathinweise aus den Aktenstücken entfernt (#363)
Der Release-Lauf zu v435.1.0 scheiterte an der Dokumentqualitätsprüfung: Vier
neue Aktenstücke der Freiburger Versorgungswerksakte trugen am Fuß die Zeile
"Formathinweis: Dieses Aktenstück wird in Times New Roman, 11 pt, mit
ausschließlich dezimaler Gliederung ausgegeben." Der Prüfer wertet das zu Recht
als verräterischen Metahinweis; in einem echten Schreiben aus der Akte steht
keine Anweisung an den Setzer.

Die Zeile wurde aus allen 49 betroffenen DOCX entfernt, auch aus älteren
Beständen in Datenschutz-, KI-Recht- und HOAI-Akten. Das Hausformat bleibt
unverändert und ist im Dokument gesetzt statt im Text behauptet.

Gesamt-PDFs der neun betroffenen Akten neu gebaut. Validatoren grün.


Claude-Session: https://claude.ai/code/session_01YXnmkjavncPDoNYycYaC5G

Co-authored-by: Claude <noreply@anthropic.com>
</commit_message>
<xml_diff>
--- a/testakten/bgb-at-altfraenkische-werkstatt/23_inserat_altwerk_aw_77_426.docx
+++ b/testakten/bgb-at-altfraenkische-werkstatt/23_inserat_altwerk_aw_77_426.docx
@@ -430,14 +430,6 @@
         <w:t>„Bei Angeboten von privat gilt das Widerrufsrecht für Verbraucherverträge nicht."</w:t>
       </w:r>
     </w:p>
-    <w:p>
-      <w:pPr>
-        <w:jc w:val="left"/>
-      </w:pPr>
-      <w:r>
-        <w:t>Formathinweis: Dieses Aktenstück wird in Times New Roman, 11 pt, mit ausschließlich dezimaler Gliederung ausgegeben.</w:t>
-      </w:r>
-    </w:p>
     <w:sectPr>
       <w:pgSz w:w="11906" w:h="16838"/>
       <w:pgMar w:top="1417" w:right="1417" w:bottom="1417" w:left="1417" w:header="720" w:footer="720" w:gutter="0"/>

</xml_diff>